<commit_message>
Regenerate three current application CVs
</commit_message>
<xml_diff>
--- a/registry/jobs/2026-08-05_065339_linro_backend-engineer-remote-germany/application/CV_ValentinNikolaev_linro_BackendEngineerGermany.docx
+++ b/registry/jobs/2026-08-05_065339_linro_backend-engineer-remote-germany/application/CV_ValentinNikolaev_linro_BackendEngineerGermany.docx
@@ -66,7 +66,7 @@
         <w:t xml:space="preserve">
 </w:t>
       </w:r>
-      <w:hyperlink w:history="1" r:id="rIdamnshs5tpvkwnshpcmfpr">
+      <w:hyperlink w:history="1" r:id="rIds_disw1ufhl6nu3wezchz">
         <w:r>
           <w:rPr>
             <w:rFonts w:ascii="Aptos" w:cs="Aptos" w:eastAsia="Aptos" w:hAnsi="Aptos"/>
@@ -100,7 +100,7 @@
         <w:t xml:space="preserve">
 </w:t>
       </w:r>
-      <w:hyperlink w:history="1" r:id="rIdw7bsijdec7nm6hztk1so7">
+      <w:hyperlink w:history="1" r:id="rId1bysqgzvgerenlhq3sawu">
         <w:r>
           <w:rPr>
             <w:rFonts w:ascii="Aptos" w:cs="Aptos" w:eastAsia="Aptos" w:hAnsi="Aptos"/>
@@ -123,7 +123,7 @@
         </w:rPr>
         <w:t xml:space="preserve"> | </w:t>
       </w:r>
-      <w:hyperlink w:history="1" r:id="rIdftge0nieed5sandsvvz7k">
+      <w:hyperlink w:history="1" r:id="rIdcymt0fksviwhzm2nw0_yp">
         <w:r>
           <w:rPr>
             <w:rFonts w:ascii="Aptos" w:cs="Aptos" w:eastAsia="Aptos" w:hAnsi="Aptos"/>
@@ -171,7 +171,7 @@
           <w:szCs w:val="24"/>
           <w:rtl w:val="false"/>
         </w:rPr>
-        <w:t xml:space="preserve">Backend engineer with 15+ years of experience designing and operating production systems, with recent focus on Go, event-driven architecture, cloud delivery, and reliability. Built queue-backed pipelines, APIs, observability, retries, and operational safeguards across AWS and Kubernetes environments. Brings early-stage product ownership, strong SQL and data-system experience, and prior work in GDPR- and PCI-regulated systems, while remaining hands-on from design through production diagnosis.</w:t>
+        <w:t xml:space="preserve">Backend engineer with 15+ years of experience designing and operating production systems, with recent focus on Go, event-driven architecture, cloud delivery, and reliability. Built queue-backed pipelines, APIs, observability, retries, and safeguards across AWS and Kubernetes. Brings early-stage ownership, strong SQL experience, and prior work in GDPR- and PCI-regulated systems.</w:t>
       </w:r>
     </w:p>
     <w:p>
@@ -233,27 +233,6 @@
           <w:szCs w:val="24"/>
           <w:rtl w:val="false"/>
         </w:rPr>
-        <w:t xml:space="preserve">Backend system design</w:t>
-      </w:r>
-    </w:p>
-    <w:p>
-      <w:pPr>
-        <w:pStyle w:val="ListParagraph"/>
-        <w:numPr>
-          <w:ilvl w:val="0"/>
-          <w:numId w:val="1"/>
-        </w:numPr>
-        <w:bidi w:val="false"/>
-        <w:spacing w:after="60" w:before="60"/>
-      </w:pPr>
-      <w:r>
-        <w:rPr>
-          <w:rFonts w:ascii="Aptos" w:cs="Aptos" w:eastAsia="Aptos" w:hAnsi="Aptos"/>
-          <w:color w:val="000000"/>
-          <w:sz w:val="24"/>
-          <w:szCs w:val="24"/>
-          <w:rtl w:val="false"/>
-        </w:rPr>
         <w:t xml:space="preserve">SQL</w:t>
       </w:r>
     </w:p>
@@ -359,7 +338,7 @@
           <w:szCs w:val="24"/>
           <w:rtl w:val="false"/>
         </w:rPr>
-        <w:t xml:space="preserve">RabbitMQ and queues</w:t>
+        <w:t xml:space="preserve">Queues and messaging</w:t>
       </w:r>
     </w:p>
     <w:p>
@@ -423,48 +402,6 @@
           <w:rtl w:val="false"/>
         </w:rPr>
         <w:t xml:space="preserve">CI/CD with GitHub Actions, Helm, and ArgoCD</w:t>
-      </w:r>
-    </w:p>
-    <w:p>
-      <w:pPr>
-        <w:pStyle w:val="ListParagraph"/>
-        <w:numPr>
-          <w:ilvl w:val="0"/>
-          <w:numId w:val="1"/>
-        </w:numPr>
-        <w:bidi w:val="false"/>
-        <w:spacing w:after="60" w:before="60"/>
-      </w:pPr>
-      <w:r>
-        <w:rPr>
-          <w:rFonts w:ascii="Aptos" w:cs="Aptos" w:eastAsia="Aptos" w:hAnsi="Aptos"/>
-          <w:color w:val="000000"/>
-          <w:sz w:val="24"/>
-          <w:szCs w:val="24"/>
-          <w:rtl w:val="false"/>
-        </w:rPr>
-        <w:t xml:space="preserve">Production reliability</w:t>
-      </w:r>
-    </w:p>
-    <w:p>
-      <w:pPr>
-        <w:pStyle w:val="ListParagraph"/>
-        <w:numPr>
-          <w:ilvl w:val="0"/>
-          <w:numId w:val="1"/>
-        </w:numPr>
-        <w:bidi w:val="false"/>
-        <w:spacing w:after="60" w:before="60"/>
-      </w:pPr>
-      <w:r>
-        <w:rPr>
-          <w:rFonts w:ascii="Aptos" w:cs="Aptos" w:eastAsia="Aptos" w:hAnsi="Aptos"/>
-          <w:color w:val="000000"/>
-          <w:sz w:val="24"/>
-          <w:szCs w:val="24"/>
-          <w:rtl w:val="false"/>
-        </w:rPr>
-        <w:t xml:space="preserve">High-availability systems</w:t>
       </w:r>
     </w:p>
     <w:p>
@@ -628,28 +565,7 @@
           <w:szCs w:val="24"/>
           <w:rtl w:val="false"/>
         </w:rPr>
-        <w:t xml:space="preserve">Built resilient message-delivery paths with retries, fallback behavior, monitoring, and operational safeguards.</w:t>
-      </w:r>
-    </w:p>
-    <w:p>
-      <w:pPr>
-        <w:pStyle w:val="ListParagraph"/>
-        <w:numPr>
-          <w:ilvl w:val="0"/>
-          <w:numId w:val="1"/>
-        </w:numPr>
-        <w:bidi w:val="false"/>
-        <w:spacing w:after="60" w:before="60"/>
-      </w:pPr>
-      <w:r>
-        <w:rPr>
-          <w:rFonts w:ascii="Aptos" w:cs="Aptos" w:eastAsia="Aptos" w:hAnsi="Aptos"/>
-          <w:color w:val="000000"/>
-          <w:sz w:val="24"/>
-          <w:szCs w:val="24"/>
-          <w:rtl w:val="false"/>
-        </w:rPr>
-        <w:t xml:space="preserve">Integrated AI-assisted triage while keeping workflow, routing, and lifecycle behavior in maintained backend services.</w:t>
+        <w:t xml:space="preserve">Built resilient delivery paths with retries, fallback behavior, and monitoring, and integrated AI-assisted triage into maintained backend services.</w:t>
       </w:r>
     </w:p>
     <w:p>
@@ -916,28 +832,7 @@
           <w:szCs w:val="24"/>
           <w:rtl w:val="false"/>
         </w:rPr>
-        <w:t xml:space="preserve">Reduced peak database workload and improved API and query performance across backend services.</w:t>
-      </w:r>
-    </w:p>
-    <w:p>
-      <w:pPr>
-        <w:pStyle w:val="ListParagraph"/>
-        <w:numPr>
-          <w:ilvl w:val="0"/>
-          <w:numId w:val="1"/>
-        </w:numPr>
-        <w:bidi w:val="false"/>
-        <w:spacing w:after="60" w:before="60"/>
-      </w:pPr>
-      <w:r>
-        <w:rPr>
-          <w:rFonts w:ascii="Aptos" w:cs="Aptos" w:eastAsia="Aptos" w:hAnsi="Aptos"/>
-          <w:color w:val="000000"/>
-          <w:sz w:val="24"/>
-          <w:szCs w:val="24"/>
-          <w:rtl w:val="false"/>
-        </w:rPr>
-        <w:t xml:space="preserve">Investigated incidents through logs, Prometheus, monitoring, and SRE dashboards and delivered operational fixes.</w:t>
+        <w:t xml:space="preserve">Improved database, API, and query performance and delivered operational fixes using logs, Prometheus, monitoring, and SRE dashboards.</w:t>
       </w:r>
     </w:p>
     <w:p>
@@ -1060,28 +955,7 @@
           <w:szCs w:val="24"/>
           <w:rtl w:val="false"/>
         </w:rPr>
-        <w:t xml:space="preserve">Defined microservice, serverless, CI/CD, and reliability decisions with the CTO.</w:t>
-      </w:r>
-    </w:p>
-    <w:p>
-      <w:pPr>
-        <w:pStyle w:val="ListParagraph"/>
-        <w:numPr>
-          <w:ilvl w:val="0"/>
-          <w:numId w:val="1"/>
-        </w:numPr>
-        <w:bidi w:val="false"/>
-        <w:spacing w:after="60" w:before="60"/>
-      </w:pPr>
-      <w:r>
-        <w:rPr>
-          <w:rFonts w:ascii="Aptos" w:cs="Aptos" w:eastAsia="Aptos" w:hAnsi="Aptos"/>
-          <w:color w:val="000000"/>
-          <w:sz w:val="24"/>
-          <w:szCs w:val="24"/>
-          <w:rtl w:val="false"/>
-        </w:rPr>
-        <w:t xml:space="preserve">Contributed directly to Go and PHP backend development on AWS and Kubernetes.</w:t>
+        <w:t xml:space="preserve">Defined architecture and reliability decisions with the CTO while contributing directly to Go and PHP development on AWS and Kubernetes.</w:t>
       </w:r>
     </w:p>
     <w:p>
@@ -1183,28 +1057,7 @@
           <w:szCs w:val="24"/>
           <w:rtl w:val="false"/>
         </w:rPr>
-        <w:t xml:space="preserve">Delivered code under PCI DSS constraints and participated in technical viability, security, and vulnerability assessments.</w:t>
-      </w:r>
-    </w:p>
-    <w:p>
-      <w:pPr>
-        <w:pStyle w:val="ListParagraph"/>
-        <w:numPr>
-          <w:ilvl w:val="0"/>
-          <w:numId w:val="1"/>
-        </w:numPr>
-        <w:bidi w:val="false"/>
-        <w:spacing w:after="60" w:before="60"/>
-      </w:pPr>
-      <w:r>
-        <w:rPr>
-          <w:rFonts w:ascii="Aptos" w:cs="Aptos" w:eastAsia="Aptos" w:hAnsi="Aptos"/>
-          <w:color w:val="000000"/>
-          <w:sz w:val="24"/>
-          <w:szCs w:val="24"/>
-          <w:rtl w:val="false"/>
-        </w:rPr>
-        <w:t xml:space="preserve">Evaluated solutions against functional, performance, and operational criteria.</w:t>
+        <w:t xml:space="preserve">Delivered code under PCI DSS constraints and participated in technical, security, and vulnerability assessments.</w:t>
       </w:r>
     </w:p>
     <w:p>
@@ -1306,28 +1159,7 @@
           <w:szCs w:val="24"/>
           <w:rtl w:val="false"/>
         </w:rPr>
-        <w:t xml:space="preserve">Designed and operated queue-backed delivery infrastructure and handled traffic growth above 10x during BFCM periods.</w:t>
-      </w:r>
-    </w:p>
-    <w:p>
-      <w:pPr>
-        <w:pStyle w:val="ListParagraph"/>
-        <w:numPr>
-          <w:ilvl w:val="0"/>
-          <w:numId w:val="1"/>
-        </w:numPr>
-        <w:bidi w:val="false"/>
-        <w:spacing w:after="60" w:before="60"/>
-      </w:pPr>
-      <w:r>
-        <w:rPr>
-          <w:rFonts w:ascii="Aptos" w:cs="Aptos" w:eastAsia="Aptos" w:hAnsi="Aptos"/>
-          <w:color w:val="000000"/>
-          <w:sz w:val="24"/>
-          <w:szCs w:val="24"/>
-          <w:rtl w:val="false"/>
-        </w:rPr>
-        <w:t xml:space="preserve">Made technical decisions across PHP, MySQL, Elasticsearch, RabbitMQ, AWS, monitoring, and email-security controls.</w:t>
+        <w:t xml:space="preserve">Designed queue-backed infrastructure for traffic growth above 10x during BFCM and made technical decisions across PHP, MySQL, RabbitMQ, AWS, monitoring, and email-security controls.</w:t>
       </w:r>
     </w:p>
     <w:p>

</xml_diff>

<commit_message>
Restore Gameinspire and narrow cover letter updates
</commit_message>
<xml_diff>
--- a/registry/jobs/2026-08-05_065339_linro_backend-engineer-remote-germany/application/CV_ValentinNikolaev_linro_BackendEngineerGermany.docx
+++ b/registry/jobs/2026-08-05_065339_linro_backend-engineer-remote-germany/application/CV_ValentinNikolaev_linro_BackendEngineerGermany.docx
@@ -66,7 +66,7 @@
         <w:t xml:space="preserve">
 </w:t>
       </w:r>
-      <w:hyperlink w:history="1" r:id="rIds_disw1ufhl6nu3wezchz">
+      <w:hyperlink w:history="1" r:id="rIdamnshs5tpvkwnshpcmfpr">
         <w:r>
           <w:rPr>
             <w:rFonts w:ascii="Aptos" w:cs="Aptos" w:eastAsia="Aptos" w:hAnsi="Aptos"/>
@@ -100,7 +100,7 @@
         <w:t xml:space="preserve">
 </w:t>
       </w:r>
-      <w:hyperlink w:history="1" r:id="rId1bysqgzvgerenlhq3sawu">
+      <w:hyperlink w:history="1" r:id="rIdw7bsijdec7nm6hztk1so7">
         <w:r>
           <w:rPr>
             <w:rFonts w:ascii="Aptos" w:cs="Aptos" w:eastAsia="Aptos" w:hAnsi="Aptos"/>
@@ -123,7 +123,7 @@
         </w:rPr>
         <w:t xml:space="preserve"> | </w:t>
       </w:r>
-      <w:hyperlink w:history="1" r:id="rIdcymt0fksviwhzm2nw0_yp">
+      <w:hyperlink w:history="1" r:id="rIdftge0nieed5sandsvvz7k">
         <w:r>
           <w:rPr>
             <w:rFonts w:ascii="Aptos" w:cs="Aptos" w:eastAsia="Aptos" w:hAnsi="Aptos"/>
@@ -171,7 +171,7 @@
           <w:szCs w:val="24"/>
           <w:rtl w:val="false"/>
         </w:rPr>
-        <w:t xml:space="preserve">Backend engineer with 15+ years of experience designing and operating production systems, with recent focus on Go, event-driven architecture, cloud delivery, and reliability. Built queue-backed pipelines, APIs, observability, retries, and safeguards across AWS and Kubernetes. Brings early-stage ownership, strong SQL experience, and prior work in GDPR- and PCI-regulated systems.</w:t>
+        <w:t xml:space="preserve">Backend engineer with 15+ years of experience designing and operating production systems, with recent focus on Go, event-driven architecture, cloud delivery, and reliability. Built queue-backed pipelines, APIs, observability, retries, and operational safeguards across AWS and Kubernetes environments. Brings early-stage product ownership, strong SQL and data-system experience, and prior work in GDPR- and PCI-regulated systems, while remaining hands-on from design through production diagnosis.</w:t>
       </w:r>
     </w:p>
     <w:p>
@@ -233,6 +233,27 @@
           <w:szCs w:val="24"/>
           <w:rtl w:val="false"/>
         </w:rPr>
+        <w:t xml:space="preserve">Backend system design</w:t>
+      </w:r>
+    </w:p>
+    <w:p>
+      <w:pPr>
+        <w:pStyle w:val="ListParagraph"/>
+        <w:numPr>
+          <w:ilvl w:val="0"/>
+          <w:numId w:val="1"/>
+        </w:numPr>
+        <w:bidi w:val="false"/>
+        <w:spacing w:after="60" w:before="60"/>
+      </w:pPr>
+      <w:r>
+        <w:rPr>
+          <w:rFonts w:ascii="Aptos" w:cs="Aptos" w:eastAsia="Aptos" w:hAnsi="Aptos"/>
+          <w:color w:val="000000"/>
+          <w:sz w:val="24"/>
+          <w:szCs w:val="24"/>
+          <w:rtl w:val="false"/>
+        </w:rPr>
         <w:t xml:space="preserve">SQL</w:t>
       </w:r>
     </w:p>
@@ -338,7 +359,7 @@
           <w:szCs w:val="24"/>
           <w:rtl w:val="false"/>
         </w:rPr>
-        <w:t xml:space="preserve">Queues and messaging</w:t>
+        <w:t xml:space="preserve">RabbitMQ and queues</w:t>
       </w:r>
     </w:p>
     <w:p>
@@ -402,6 +423,48 @@
           <w:rtl w:val="false"/>
         </w:rPr>
         <w:t xml:space="preserve">CI/CD with GitHub Actions, Helm, and ArgoCD</w:t>
+      </w:r>
+    </w:p>
+    <w:p>
+      <w:pPr>
+        <w:pStyle w:val="ListParagraph"/>
+        <w:numPr>
+          <w:ilvl w:val="0"/>
+          <w:numId w:val="1"/>
+        </w:numPr>
+        <w:bidi w:val="false"/>
+        <w:spacing w:after="60" w:before="60"/>
+      </w:pPr>
+      <w:r>
+        <w:rPr>
+          <w:rFonts w:ascii="Aptos" w:cs="Aptos" w:eastAsia="Aptos" w:hAnsi="Aptos"/>
+          <w:color w:val="000000"/>
+          <w:sz w:val="24"/>
+          <w:szCs w:val="24"/>
+          <w:rtl w:val="false"/>
+        </w:rPr>
+        <w:t xml:space="preserve">Production reliability</w:t>
+      </w:r>
+    </w:p>
+    <w:p>
+      <w:pPr>
+        <w:pStyle w:val="ListParagraph"/>
+        <w:numPr>
+          <w:ilvl w:val="0"/>
+          <w:numId w:val="1"/>
+        </w:numPr>
+        <w:bidi w:val="false"/>
+        <w:spacing w:after="60" w:before="60"/>
+      </w:pPr>
+      <w:r>
+        <w:rPr>
+          <w:rFonts w:ascii="Aptos" w:cs="Aptos" w:eastAsia="Aptos" w:hAnsi="Aptos"/>
+          <w:color w:val="000000"/>
+          <w:sz w:val="24"/>
+          <w:szCs w:val="24"/>
+          <w:rtl w:val="false"/>
+        </w:rPr>
+        <w:t xml:space="preserve">High-availability systems</w:t>
       </w:r>
     </w:p>
     <w:p>
@@ -565,7 +628,28 @@
           <w:szCs w:val="24"/>
           <w:rtl w:val="false"/>
         </w:rPr>
-        <w:t xml:space="preserve">Built resilient delivery paths with retries, fallback behavior, and monitoring, and integrated AI-assisted triage into maintained backend services.</w:t>
+        <w:t xml:space="preserve">Built resilient message-delivery paths with retries, fallback behavior, monitoring, and operational safeguards.</w:t>
+      </w:r>
+    </w:p>
+    <w:p>
+      <w:pPr>
+        <w:pStyle w:val="ListParagraph"/>
+        <w:numPr>
+          <w:ilvl w:val="0"/>
+          <w:numId w:val="1"/>
+        </w:numPr>
+        <w:bidi w:val="false"/>
+        <w:spacing w:after="60" w:before="60"/>
+      </w:pPr>
+      <w:r>
+        <w:rPr>
+          <w:rFonts w:ascii="Aptos" w:cs="Aptos" w:eastAsia="Aptos" w:hAnsi="Aptos"/>
+          <w:color w:val="000000"/>
+          <w:sz w:val="24"/>
+          <w:szCs w:val="24"/>
+          <w:rtl w:val="false"/>
+        </w:rPr>
+        <w:t xml:space="preserve">Integrated AI-assisted triage while keeping workflow, routing, and lifecycle behavior in maintained backend services.</w:t>
       </w:r>
     </w:p>
     <w:p>
@@ -832,7 +916,28 @@
           <w:szCs w:val="24"/>
           <w:rtl w:val="false"/>
         </w:rPr>
-        <w:t xml:space="preserve">Improved database, API, and query performance and delivered operational fixes using logs, Prometheus, monitoring, and SRE dashboards.</w:t>
+        <w:t xml:space="preserve">Reduced peak database workload and improved API and query performance across backend services.</w:t>
+      </w:r>
+    </w:p>
+    <w:p>
+      <w:pPr>
+        <w:pStyle w:val="ListParagraph"/>
+        <w:numPr>
+          <w:ilvl w:val="0"/>
+          <w:numId w:val="1"/>
+        </w:numPr>
+        <w:bidi w:val="false"/>
+        <w:spacing w:after="60" w:before="60"/>
+      </w:pPr>
+      <w:r>
+        <w:rPr>
+          <w:rFonts w:ascii="Aptos" w:cs="Aptos" w:eastAsia="Aptos" w:hAnsi="Aptos"/>
+          <w:color w:val="000000"/>
+          <w:sz w:val="24"/>
+          <w:szCs w:val="24"/>
+          <w:rtl w:val="false"/>
+        </w:rPr>
+        <w:t xml:space="preserve">Investigated incidents through logs, Prometheus, monitoring, and SRE dashboards and delivered operational fixes.</w:t>
       </w:r>
     </w:p>
     <w:p>
@@ -955,7 +1060,28 @@
           <w:szCs w:val="24"/>
           <w:rtl w:val="false"/>
         </w:rPr>
-        <w:t xml:space="preserve">Defined architecture and reliability decisions with the CTO while contributing directly to Go and PHP development on AWS and Kubernetes.</w:t>
+        <w:t xml:space="preserve">Defined microservice, serverless, CI/CD, and reliability decisions with the CTO.</w:t>
+      </w:r>
+    </w:p>
+    <w:p>
+      <w:pPr>
+        <w:pStyle w:val="ListParagraph"/>
+        <w:numPr>
+          <w:ilvl w:val="0"/>
+          <w:numId w:val="1"/>
+        </w:numPr>
+        <w:bidi w:val="false"/>
+        <w:spacing w:after="60" w:before="60"/>
+      </w:pPr>
+      <w:r>
+        <w:rPr>
+          <w:rFonts w:ascii="Aptos" w:cs="Aptos" w:eastAsia="Aptos" w:hAnsi="Aptos"/>
+          <w:color w:val="000000"/>
+          <w:sz w:val="24"/>
+          <w:szCs w:val="24"/>
+          <w:rtl w:val="false"/>
+        </w:rPr>
+        <w:t xml:space="preserve">Contributed directly to Go and PHP backend development on AWS and Kubernetes.</w:t>
       </w:r>
     </w:p>
     <w:p>
@@ -1057,7 +1183,28 @@
           <w:szCs w:val="24"/>
           <w:rtl w:val="false"/>
         </w:rPr>
-        <w:t xml:space="preserve">Delivered code under PCI DSS constraints and participated in technical, security, and vulnerability assessments.</w:t>
+        <w:t xml:space="preserve">Delivered code under PCI DSS constraints and participated in technical viability, security, and vulnerability assessments.</w:t>
+      </w:r>
+    </w:p>
+    <w:p>
+      <w:pPr>
+        <w:pStyle w:val="ListParagraph"/>
+        <w:numPr>
+          <w:ilvl w:val="0"/>
+          <w:numId w:val="1"/>
+        </w:numPr>
+        <w:bidi w:val="false"/>
+        <w:spacing w:after="60" w:before="60"/>
+      </w:pPr>
+      <w:r>
+        <w:rPr>
+          <w:rFonts w:ascii="Aptos" w:cs="Aptos" w:eastAsia="Aptos" w:hAnsi="Aptos"/>
+          <w:color w:val="000000"/>
+          <w:sz w:val="24"/>
+          <w:szCs w:val="24"/>
+          <w:rtl w:val="false"/>
+        </w:rPr>
+        <w:t xml:space="preserve">Evaluated solutions against functional, performance, and operational criteria.</w:t>
       </w:r>
     </w:p>
     <w:p>
@@ -1159,7 +1306,28 @@
           <w:szCs w:val="24"/>
           <w:rtl w:val="false"/>
         </w:rPr>
-        <w:t xml:space="preserve">Designed queue-backed infrastructure for traffic growth above 10x during BFCM and made technical decisions across PHP, MySQL, RabbitMQ, AWS, monitoring, and email-security controls.</w:t>
+        <w:t xml:space="preserve">Designed and operated queue-backed delivery infrastructure and handled traffic growth above 10x during BFCM periods.</w:t>
+      </w:r>
+    </w:p>
+    <w:p>
+      <w:pPr>
+        <w:pStyle w:val="ListParagraph"/>
+        <w:numPr>
+          <w:ilvl w:val="0"/>
+          <w:numId w:val="1"/>
+        </w:numPr>
+        <w:bidi w:val="false"/>
+        <w:spacing w:after="60" w:before="60"/>
+      </w:pPr>
+      <w:r>
+        <w:rPr>
+          <w:rFonts w:ascii="Aptos" w:cs="Aptos" w:eastAsia="Aptos" w:hAnsi="Aptos"/>
+          <w:color w:val="000000"/>
+          <w:sz w:val="24"/>
+          <w:szCs w:val="24"/>
+          <w:rtl w:val="false"/>
+        </w:rPr>
+        <w:t xml:space="preserve">Made technical decisions across PHP, MySQL, Elasticsearch, RabbitMQ, AWS, monitoring, and email-security controls.</w:t>
       </w:r>
     </w:p>
     <w:p>

</xml_diff>